<commit_message>
Link una-oc.org in resume
</commit_message>
<xml_diff>
--- a/resume.docx
+++ b/resume.docx
@@ -468,7 +468,18 @@
         <w:spacing w:before="20" w:after="20"/>
       </w:pPr>
       <w:r>
-        <w:t>Redesigned the chapter’s Squarespace site (una-oc.org) with the Board President and fellow Directors, refreshing the layout and UI with custom CSS, reorganizing site content, and featuring upcoming events on the homepage</w:t>
+        <w:t xml:space="preserve">Redesigned the chapter’s Squarespace site (</w:t>
+      </w:r>
+      <w:hyperlink r:id="rId10" w:history="1">
+        <w:r>
+          <w:rPr>
+            <w:u w:val="single"/>
+          </w:rPr>
+          <w:t>una-oc.org</w:t>
+        </w:r>
+      </w:hyperlink>
+      <w:r>
+        <w:t xml:space="preserve">) with the Board President and fellow Directors, refreshing the layout and UI with custom CSS, reorganizing site content, and featuring upcoming events on the homepage</w:t>
       </w:r>
     </w:p>
     <w:p>

</xml_diff>